<commit_message>
Atualiza o resumo do curso: adiciona o Mundo 3
</commit_message>
<xml_diff>
--- a/Cursos em Video (Gustavo Guanabara).docx
+++ b/Cursos em Video (Gustavo Guanabara).docx
@@ -7,40 +7,15 @@
         <w:pStyle w:val="Ttulo1"/>
       </w:pPr>
       <w:r>
-        <w:t>CURSO DE PYTHON 3 – CURSO EM VÍDEO (MUNDOS 1 E 2)</w:t>
+        <w:t xml:space="preserve">CURSO DE PYTHON 3 – CURSO EM VÍDEO (MUNDOS 1, 2 E 3)</w:t>
       </w:r>
     </w:p>
     <w:p>
       <w:r>
-        <w:rPr>
-          <w:b/>
-        </w:rPr>
-        <w:t>INTRODUÇÃO</w:t>
+        <w:t xml:space="preserve">INTRODUÇÃO</w:t>
       </w:r>
       <w:r>
-        <w:rPr>
-          <w:b/>
-        </w:rPr>
-        <w:br/>
-      </w:r>
-      <w:r>
-        <w:t xml:space="preserve">A </w:t>
-      </w:r>
-      <w:proofErr w:type="spellStart"/>
-      <w:r>
-        <w:t>programação</w:t>
-      </w:r>
-      <w:proofErr w:type="spellEnd"/>
-      <w:r>
-        <w:t xml:space="preserve"> </w:t>
-      </w:r>
-      <w:proofErr w:type="spellStart"/>
-      <w:r>
-        <w:t>está</w:t>
-      </w:r>
-      <w:proofErr w:type="spellEnd"/>
-      <w:r>
-        <w:t xml:space="preserve"> presente em diversas áreas da tecnologia, sendo utilizada no desenvolvimento de sites, aplicativos, jogos e sistemas. Entre as linguagens mais populares da atualidade está o Python, conhecido por sua sintaxe simples e facilidade de aprendizado. Durante os Mundos 1 e 2 do Curso de Python do professor Gustavo Guanabara, foram apresentados os conceitos fundamentais da programação e as principais estruturas da linguagem. Este trabalho descreve os conteúdos estudados e explica a função de cada recurso.</w:t>
+        <w:t xml:space="preserve"> A programação está presente em diversas áreas da tecnologia, sendo utilizada no desenvolvimento de sites, aplicativos, jogos e sistemas. Entre as linguagens mais populares da atualidade está o Python, conhecido por sua sintaxe simples e facilidade de aprendizado. Durante os Mundos 1, 2 e 3 do Curso de Python do professor Gustavo Guanabara, foram apresentados os conceitos fundamentais da programação, as principais estruturas da linguagem e as estruturas compostas e funções que preparam o estudante para projetos maiores. Este trabalho descreve os conteúdos estudados e explica a função de cada recurso.</w:t>
       </w:r>
     </w:p>
     <w:p>
@@ -339,12 +314,137 @@
         <w:pStyle w:val="Ttulo2"/>
       </w:pPr>
       <w:r>
+        <w:t xml:space="preserve">MUNDO 3 – ESTRUTURAS COMPOSTAS E FUNÇÕES</w:t>
+      </w:r>
+    </w:p>
+    <w:p>
+      <w:pPr>
+        <w:pStyle w:val="Ttulo3"/>
+      </w:pPr>
+      <w:r>
+        <w:t xml:space="preserve">Tuplas</w:t>
+      </w:r>
+    </w:p>
+    <w:p>
+      <w:r>
+        <w:t xml:space="preserve">Tuplas são estruturas semelhantes às listas, porém imutáveis: depois de criadas, seus dados não podem ser alterados. São muito utilizadas para armazenar coleções fixas de valores, como listas de times ou de produtos.</w:t>
+      </w:r>
+    </w:p>
+    <w:p>
+      <w:pPr>
+        <w:pStyle w:val="Ttulo3"/>
+      </w:pPr>
+      <w:r>
+        <w:t xml:space="preserve">Listas</w:t>
+      </w:r>
+    </w:p>
+    <w:p>
+      <w:r>
+        <w:t xml:space="preserve">As listas armazenam vários valores em uma única variável e podem ser modificadas a qualquer momento, permitindo adicionar, remover e ordenar elementos com métodos como append(), insert() e sort().</w:t>
+      </w:r>
+    </w:p>
+    <w:p>
+      <w:pPr>
+        <w:pStyle w:val="Ttulo3"/>
+      </w:pPr>
+      <w:r>
+        <w:t xml:space="preserve">Fatiamento e enumerate</w:t>
+      </w:r>
+    </w:p>
+    <w:p>
+      <w:r>
+        <w:t xml:space="preserve">O fatiamento permite selecionar partes de uma tupla ou lista usando intervalos, como lista[2:5]. Já o enumerate() percorre uma estrutura retornando ao mesmo tempo a posição e o valor de cada elemento.</w:t>
+      </w:r>
+    </w:p>
+    <w:p>
+      <w:pPr>
+        <w:pStyle w:val="Ttulo3"/>
+      </w:pPr>
+      <w:r>
+        <w:t xml:space="preserve">Listas Compostas e Matrizes</w:t>
+      </w:r>
+    </w:p>
+    <w:p>
+      <w:r>
+        <w:t xml:space="preserve">Uma lista pode conter outras listas, formando estruturas compostas e matrizes. Essa organização é muito útil para representar tabelas, boletins escolares e grades de valores.</w:t>
+      </w:r>
+    </w:p>
+    <w:p>
+      <w:pPr>
+        <w:pStyle w:val="Ttulo3"/>
+      </w:pPr>
+      <w:r>
+        <w:t xml:space="preserve">Dicionários</w:t>
+      </w:r>
+    </w:p>
+    <w:p>
+      <w:r>
+        <w:t xml:space="preserve">Os dicionários armazenam dados no formato chave e valor, permitindo localizar informações de forma rápida e organizada. Os métodos keys(), values() e items() dão acesso às chaves, aos valores e aos pares de dados.</w:t>
+      </w:r>
+    </w:p>
+    <w:p>
+      <w:pPr>
+        <w:pStyle w:val="Ttulo3"/>
+      </w:pPr>
+      <w:r>
+        <w:t xml:space="preserve">Funções</w:t>
+      </w:r>
+    </w:p>
+    <w:p>
+      <w:r>
+        <w:t xml:space="preserve">As funções permitem agrupar comandos em blocos reutilizáveis, criados com a palavra def. Elas podem receber parâmetros, retornar resultados com return e ter valores padrão, deixando o código mais organizado e com menos repetição.</w:t>
+      </w:r>
+    </w:p>
+    <w:p>
+      <w:pPr>
+        <w:pStyle w:val="Ttulo3"/>
+      </w:pPr>
+      <w:r>
+        <w:t xml:space="preserve">Empacotamento de Parâmetros</w:t>
+      </w:r>
+    </w:p>
+    <w:p>
+      <w:r>
+        <w:t xml:space="preserve">Com o símbolo *, uma função pode receber uma quantidade qualquer de parâmetros de uma só vez. Também é possível desempacotar listas e tuplas em variáveis separadas.</w:t>
+      </w:r>
+    </w:p>
+    <w:p>
+      <w:pPr>
+        <w:pStyle w:val="Ttulo3"/>
+      </w:pPr>
+      <w:r>
+        <w:t xml:space="preserve">Modularização</w:t>
+      </w:r>
+    </w:p>
+    <w:p>
+      <w:r>
+        <w:t xml:space="preserve">A modularização consiste em dividir o programa em arquivos e funções, utilizando import para aproveitar o código em vários lugares. Isso deixa os projetos maiores mais fáceis de entender e manter.</w:t>
+      </w:r>
+    </w:p>
+    <w:p>
+      <w:pPr>
+        <w:pStyle w:val="Ttulo3"/>
+      </w:pPr>
+      <w:r>
+        <w:t xml:space="preserve">Tratamento de Erros</w:t>
+      </w:r>
+    </w:p>
+    <w:p>
+      <w:r>
+        <w:t xml:space="preserve">Com try e except, o programa consegue lidar com situações inesperadas, como o usuário digitar um valor inválido, sem interromper a execução de forma abrupta.</w:t>
+      </w:r>
+    </w:p>
+    <w:p>
+      <w:pPr>
+        <w:pStyle w:val="Ttulo2"/>
+      </w:pPr>
+      <w:r>
         <w:t>EXEMPLOS DE APLICAÇÃO</w:t>
       </w:r>
     </w:p>
     <w:p>
       <w:r>
-        <w:t>Os conhecimentos adquiridos nos Mundos 1 e 2 permitem desenvolver programas capazes de realizar cálculos, verificar condições, cadastrar usuários, criar menus interativos e automatizar tarefas simples. Esses conceitos também servem como base para conteúdos mais avançados, como listas, funções, orientação a objetos e desenvolvimento de sistemas completos.</w:t>
+        <w:t xml:space="preserve">Os conhecimentos adquiridos nos três Mundos permitem desenvolver programas capazes de realizar cálculos, verificar condições, cadastrar usuários, criar menus interativos, organizar dados em listas, tuplas e dicionários, criar funções reutilizáveis e automatizar tarefas completas. Esses conceitos também servem como base para conteúdos mais avançados, como orientação a objetos, módulos externos e desenvolvimento de sistemas completos.</w:t>
       </w:r>
     </w:p>
     <w:p>
@@ -357,7 +457,7 @@
     </w:p>
     <w:p>
       <w:r>
-        <w:t>Os Mundos 1 e 2 do Curso de Python forneceram uma base sólida para o aprendizado da programação. Durante o curso foram estudados conceitos fundamentais como variáveis, entrada e saída de dados, tipos primitivos, operadores matemáticos, manipulação de textos, estruturas condicionais e estruturas de repetição. Além do conhecimento técnico, o curso contribuiu para o desenvolvimento do raciocínio lógico e da capacidade de resolver problemas utilizando a tecnologia. Esses conhecimentos são essenciais para qualquer estudante que deseja seguir na área de programação.</w:t>
+        <w:t xml:space="preserve">Os três Mundos do Curso de Python forneceram uma base sólida para o aprendizado da programação. Durante o curso foram estudados conceitos fundamentais como variáveis, entrada e saída de dados, tipos primitivos, operadores matemáticos, manipulação de textos, estruturas condicionais, estruturas de repetição, tuplas, listas, dicionários e funções. Além do conhecimento técnico, o curso contribuiu para o desenvolvimento do raciocínio lógico e da capacidade de resolver problemas utilizando a tecnologia. Com a conclusão dos 105 desafios, esses conhecimentos são essenciais para qualquer estudante que deseja seguir na área de programação.</w:t>
       </w:r>
     </w:p>
     <w:sectPr>

</xml_diff>